<commit_message>
fix: set repo name and upstream user, add devcontainer and env template
- Set UPSTREAM_USER in scripts/cek_kesiapan.py and update repo name
  in README clone instructions
- Add .devcontainer (GitHub Codespaces), .vscode (recommended
  extensions) and .env.example
- Simplify .gitignore
- Update docs/Panduan_Instalasi_Setup.docx

Co-Authored-By: Claude Sonnet 5.5 <noreply@anthropic.com>
</commit_message>
<xml_diff>
--- a/docs/Panduan_Instalasi_Setup.docx
+++ b/docs/Panduan_Instalasi_Setup.docx
@@ -6155,7 +6155,7 @@
         <w:spacing w:after="70"/>
       </w:pPr>
       <w:r>
-        <w:t xml:space="preserve">Login ke GitHub, buka https://github.com/YOUR_GITHUB_USERNAME/workshop-data-pipeline, lalu klik </w:t>
+        <w:t xml:space="preserve">Login ke GitHub, buka https://github.com/AisahAlfiyatusR/data-science-workshop, lalu klik </w:t>
       </w:r>
       <w:r>
         <w:rPr>
@@ -6255,7 +6255,7 @@
                 <w:sz w:val="18"/>
                 <w:szCs w:val="18"/>
               </w:rPr>
-              <w:t xml:space="preserve">git clone https://github.com/&lt;username-anda&gt;/workshop-data-pipeline.git</w:t>
+              <w:t xml:space="preserve">git clone https://github.com/&lt;username-anda&gt;/data-science-workshop.git</w:t>
             </w:r>
           </w:p>
           <w:p>
@@ -6269,7 +6269,7 @@
                 <w:sz w:val="18"/>
                 <w:szCs w:val="18"/>
               </w:rPr>
-              <w:t xml:space="preserve">cd workshop-data-pipeline</w:t>
+              <w:t xml:space="preserve">cd data-science-workshop</w:t>
             </w:r>
           </w:p>
           <w:p>

</xml_diff>